<commit_message>
Realiza mejoras en el documento y presentación
</commit_message>
<xml_diff>
--- a/CIB302_Marco Araya Salazar semana 7.docx
+++ b/CIB302_Marco Araya Salazar semana 7.docx
@@ -16,7 +16,7 @@
           <w:lang w:val="es-ES_tradnl"/>
         </w:rPr>
         <w:drawing>
-          <wp:anchor distT="0" distB="0" distL="114300" distR="114300" simplePos="0" relativeHeight="251658240" behindDoc="1" locked="0" layoutInCell="1" allowOverlap="1" wp14:anchorId="2D66BE1D" wp14:editId="1ACBD1F8">
+          <wp:anchor distT="0" distB="0" distL="114300" distR="114300" simplePos="0" relativeHeight="251658240" behindDoc="1" locked="0" layoutInCell="1" allowOverlap="1" wp14:anchorId="2D66BE1D" wp14:editId="2B42847A">
             <wp:simplePos x="0" y="0"/>
             <wp:positionH relativeFrom="column">
               <wp:posOffset>-589915</wp:posOffset>
@@ -3013,7 +3013,7 @@
         </w:rPr>
         <w:lastRenderedPageBreak/>
         <w:drawing>
-          <wp:anchor distT="0" distB="0" distL="114300" distR="114300" simplePos="0" relativeHeight="251661315" behindDoc="0" locked="0" layoutInCell="1" allowOverlap="1" wp14:anchorId="60932367" wp14:editId="22B87E23">
+          <wp:anchor distT="0" distB="0" distL="114300" distR="114300" simplePos="0" relativeHeight="251661315" behindDoc="0" locked="0" layoutInCell="1" allowOverlap="1" wp14:anchorId="60932367" wp14:editId="22E0F5CD">
             <wp:simplePos x="0" y="0"/>
             <wp:positionH relativeFrom="margin">
               <wp:align>center</wp:align>
@@ -3293,6 +3293,14 @@
         </w:rPr>
         <w:t xml:space="preserve"> y cifrado de datos permite reducir los riesgos asociados a aplicaciones web. Finalmente, el uso de instrucciones DDL, DML y DCL asegura un correcto manejo de la información dentro del sistema.</w:t>
       </w:r>
+    </w:p>
+    <w:p>
+      <w:pPr>
+        <w:rPr>
+          <w:rFonts w:asciiTheme="minorHAnsi" w:hAnsiTheme="minorHAnsi" w:cstheme="minorHAnsi"/>
+          <w:color w:val="auto"/>
+        </w:rPr>
+      </w:pPr>
     </w:p>
     <w:p>
       <w:pPr>
@@ -13019,30 +13027,6 @@
 </file>
 
 <file path=customXml/item3.xml><?xml version="1.0" encoding="utf-8"?>
-<p:properties xmlns:p="http://schemas.microsoft.com/office/2006/metadata/properties" xmlns:xsi="http://www.w3.org/2001/XMLSchema-instance" xmlns:pc="http://schemas.microsoft.com/office/infopath/2007/PartnerControls">
-  <documentManagement>
-    <lcf76f155ced4ddcb4097134ff3c332f xmlns="f9d6f6a8-4c53-4eb2-bc43-5970dc157c21">
-      <Terms xmlns="http://schemas.microsoft.com/office/infopath/2007/PartnerControls"/>
-    </lcf76f155ced4ddcb4097134ff3c332f>
-    <Prueba xmlns="f9d6f6a8-4c53-4eb2-bc43-5970dc157c21" xsi:nil="true"/>
-    <Estado xmlns="f9d6f6a8-4c53-4eb2-bc43-5970dc157c21" xsi:nil="true"/>
-    <TaxCatchAll xmlns="cde5a5e2-932b-4139-8354-a8de2ed6db86" xsi:nil="true"/>
-    <Fecha_x0020__x00fa_ltimo_x0020_recurso xmlns="f9d6f6a8-4c53-4eb2-bc43-5970dc157c21" xsi:nil="true"/>
-    <_Flow_SignoffStatus xmlns="f9d6f6a8-4c53-4eb2-bc43-5970dc157c21" xsi:nil="true"/>
-  </documentManagement>
-</p:properties>
-</file>
-
-<file path=customXml/item4.xml><?xml version="1.0" encoding="utf-8"?>
-<?mso-contentType ?>
-<FormTemplates xmlns="http://schemas.microsoft.com/sharepoint/v3/contenttype/forms">
-  <Display>DocumentLibraryForm</Display>
-  <Edit>DocumentLibraryForm</Edit>
-  <New>DocumentLibraryForm</New>
-</FormTemplates>
-</file>
-
-<file path=customXml/item5.xml><?xml version="1.0" encoding="utf-8"?>
 <b:Sources xmlns:b="http://schemas.openxmlformats.org/officeDocument/2006/bibliography" xmlns="http://schemas.openxmlformats.org/officeDocument/2006/bibliography" SelectedStyle="\APASixthEditionOfficeOnline.xsl" StyleName="APA" Version="6">
   <b:Source>
     <b:Tag>Pér95</b:Tag>
@@ -13269,6 +13253,30 @@
 </b:Sources>
 </file>
 
+<file path=customXml/item4.xml><?xml version="1.0" encoding="utf-8"?>
+<?mso-contentType ?>
+<FormTemplates xmlns="http://schemas.microsoft.com/sharepoint/v3/contenttype/forms">
+  <Display>DocumentLibraryForm</Display>
+  <Edit>DocumentLibraryForm</Edit>
+  <New>DocumentLibraryForm</New>
+</FormTemplates>
+</file>
+
+<file path=customXml/item5.xml><?xml version="1.0" encoding="utf-8"?>
+<p:properties xmlns:p="http://schemas.microsoft.com/office/2006/metadata/properties" xmlns:xsi="http://www.w3.org/2001/XMLSchema-instance" xmlns:pc="http://schemas.microsoft.com/office/infopath/2007/PartnerControls">
+  <documentManagement>
+    <lcf76f155ced4ddcb4097134ff3c332f xmlns="f9d6f6a8-4c53-4eb2-bc43-5970dc157c21">
+      <Terms xmlns="http://schemas.microsoft.com/office/infopath/2007/PartnerControls"/>
+    </lcf76f155ced4ddcb4097134ff3c332f>
+    <Prueba xmlns="f9d6f6a8-4c53-4eb2-bc43-5970dc157c21" xsi:nil="true"/>
+    <Estado xmlns="f9d6f6a8-4c53-4eb2-bc43-5970dc157c21" xsi:nil="true"/>
+    <TaxCatchAll xmlns="cde5a5e2-932b-4139-8354-a8de2ed6db86" xsi:nil="true"/>
+    <Fecha_x0020__x00fa_ltimo_x0020_recurso xmlns="f9d6f6a8-4c53-4eb2-bc43-5970dc157c21" xsi:nil="true"/>
+    <_Flow_SignoffStatus xmlns="f9d6f6a8-4c53-4eb2-bc43-5970dc157c21" xsi:nil="true"/>
+  </documentManagement>
+</p:properties>
+</file>
+
 <file path=customXml/itemProps1.xml><?xml version="1.0" encoding="utf-8"?>
 <ds:datastoreItem xmlns:ds="http://schemas.openxmlformats.org/officeDocument/2006/customXml" ds:itemID="{55AF091B-3C7A-41E3-B477-F2FDAA23CFDA}">
   <ds:schemaRefs>
@@ -13297,12 +13305,9 @@
 </file>
 
 <file path=customXml/itemProps3.xml><?xml version="1.0" encoding="utf-8"?>
-<ds:datastoreItem xmlns:ds="http://schemas.openxmlformats.org/officeDocument/2006/customXml" ds:itemID="{6593AE01-2D0B-457F-B235-F72C3C6C9419}">
+<ds:datastoreItem xmlns:ds="http://schemas.openxmlformats.org/officeDocument/2006/customXml" ds:itemID="{89B45460-C9E9-D749-A438-384C37C10EA7}">
   <ds:schemaRefs>
-    <ds:schemaRef ds:uri="http://schemas.microsoft.com/office/2006/metadata/properties"/>
-    <ds:schemaRef ds:uri="http://schemas.microsoft.com/office/infopath/2007/PartnerControls"/>
-    <ds:schemaRef ds:uri="f9d6f6a8-4c53-4eb2-bc43-5970dc157c21"/>
-    <ds:schemaRef ds:uri="cde5a5e2-932b-4139-8354-a8de2ed6db86"/>
+    <ds:schemaRef ds:uri="http://schemas.openxmlformats.org/officeDocument/2006/bibliography"/>
   </ds:schemaRefs>
 </ds:datastoreItem>
 </file>
@@ -13316,9 +13321,12 @@
 </file>
 
 <file path=customXml/itemProps5.xml><?xml version="1.0" encoding="utf-8"?>
-<ds:datastoreItem xmlns:ds="http://schemas.openxmlformats.org/officeDocument/2006/customXml" ds:itemID="{89B45460-C9E9-D749-A438-384C37C10EA7}">
+<ds:datastoreItem xmlns:ds="http://schemas.openxmlformats.org/officeDocument/2006/customXml" ds:itemID="{6593AE01-2D0B-457F-B235-F72C3C6C9419}">
   <ds:schemaRefs>
-    <ds:schemaRef ds:uri="http://schemas.openxmlformats.org/officeDocument/2006/bibliography"/>
+    <ds:schemaRef ds:uri="http://schemas.microsoft.com/office/2006/metadata/properties"/>
+    <ds:schemaRef ds:uri="http://schemas.microsoft.com/office/infopath/2007/PartnerControls"/>
+    <ds:schemaRef ds:uri="f9d6f6a8-4c53-4eb2-bc43-5970dc157c21"/>
+    <ds:schemaRef ds:uri="cde5a5e2-932b-4139-8354-a8de2ed6db86"/>
   </ds:schemaRefs>
 </ds:datastoreItem>
 </file>
</xml_diff>